<commit_message>
feat: update the B2C legal documents and show their last-updated date
New revision of the terms, privacy and cookie policy from the legal team,
published as written. The last-updated date is 07.10.2026 and now appears
in the header of all three pages (the terms also carry it in their text).
support@ addresses in the documents become mailto links.

Co-Authored-By: Claude Sonnet 5.5 <noreply@anthropic.com>
</commit_message>
<xml_diff>
--- a/docs/b2c_docs/ЧЕРНОВА- B2C- Общи условия за ползване (Terms & Conditions).docx
+++ b/docs/b2c_docs/ЧЕРНОВА- B2C- Общи условия за ползване (Terms & Conditions).docx
@@ -99,40 +99,6 @@
           <w:between w:color="auto" w:space="0" w:sz="0" w:val="none"/>
         </w:pBdr>
         <w:shd w:fill="ffffff" w:val="clear"/>
-        <w:spacing w:after="120" w:line="268.8" w:lineRule="auto"/>
-        <w:jc w:val="both"/>
-        <w:rPr>
-          <w:rFonts w:ascii="Rubik" w:cs="Rubik" w:eastAsia="Rubik" w:hAnsi="Rubik"/>
-        </w:rPr>
-      </w:pPr>
-      <w:r>
-        <w:rPr>
-          <w:rFonts w:ascii="Rubik" w:cs="Rubik" w:eastAsia="Rubik" w:hAnsi="Rubik"/>
-          <w:b w:val="1"/>
-          <w:bCs w:val="1"/>
-          <w:rtl w:val="0"/>
-        </w:rPr>
-        <w:t xml:space="preserve">Важно:</w:t>
-      </w:r>
-      <w:r>
-        <w:rPr>
-          <w:rFonts w:ascii="Rubik" w:cs="Rubik" w:eastAsia="Rubik" w:hAnsi="Rubik"/>
-          <w:rtl w:val="0"/>
-        </w:rPr>
-        <w:t xml:space="preserve"> FoodSave предоставя технологична и посредническа услуга. Продавач на храната е посоченият в конкретната оферта търговски обект. Текстът е проект и следва да бъде одобрен от юридически и счетоводен консултант преди публикуване.</w:t>
-      </w:r>
-    </w:p>
-    <w:p>
-      <w:pPr>
-        <w:widowControl w:val="0"/>
-        <w:pBdr>
-          <w:top w:color="auto" w:space="0" w:sz="0" w:val="none"/>
-          <w:left w:color="auto" w:space="0" w:sz="0" w:val="none"/>
-          <w:bottom w:color="auto" w:space="0" w:sz="0" w:val="none"/>
-          <w:right w:color="auto" w:space="0" w:sz="0" w:val="none"/>
-          <w:between w:color="auto" w:space="0" w:sz="0" w:val="none"/>
-        </w:pBdr>
-        <w:shd w:fill="ffffff" w:val="clear"/>
         <w:spacing w:after="120" w:before="240" w:line="268.8" w:lineRule="auto"/>
         <w:jc w:val="both"/>
         <w:rPr>
@@ -184,7 +150,7 @@
           <w:rFonts w:ascii="Rubik" w:cs="Rubik" w:eastAsia="Rubik" w:hAnsi="Rubik"/>
           <w:rtl w:val="0"/>
         </w:rPr>
-        <w:t xml:space="preserve">Платформата се управлява от „ФУУДСЕЙФ“ ООД, ЕИК 208808740, със седалище и адрес на управление: гр. Стара Загора, ул. „Братя Жекови“ № 31, ет. 5, ап. 10, представлявано от Деян Руменов Николов, наричано по-долу „FoodSave“, „ние“ или „нас“.</w:t>
+        <w:t xml:space="preserve">Платформата се управлява от „ФУУДСЕЙВ“ ООД, ЕИК 208808740, със седалище и адрес на управление: гр. Стара Загора, ул. „Братя Жекови“ № 31, ет. 5, ап. 10, представлявано от Деян Руменов Николов, наричано по-долу „FoodSave“, „ние“ или „нас“.</w:t>
       </w:r>
     </w:p>
     <w:p>
@@ -214,7 +180,25 @@
           <w:szCs w:val="21"/>
           <w:rtl w:val="0"/>
         </w:rPr>
-        <w:t xml:space="preserve">Имейл: contact@foodsave.tech</w:t>
+        <w:t xml:space="preserve">Имейл: </w:t>
+      </w:r>
+      <w:r>
+        <w:rPr>
+          <w:rFonts w:ascii="Rubik" w:cs="Rubik" w:eastAsia="Rubik" w:hAnsi="Rubik"/>
+          <w:sz w:val="21"/>
+          <w:szCs w:val="21"/>
+          <w:rtl w:val="0"/>
+        </w:rPr>
+        <w:t xml:space="preserve">support@foodsave.tech</w:t>
+      </w:r>
+      <w:r>
+        <w:rPr>
+          <w:rFonts w:ascii="Rubik" w:cs="Rubik" w:eastAsia="Rubik" w:hAnsi="Rubik"/>
+          <w:sz w:val="21"/>
+          <w:szCs w:val="21"/>
+          <w:rtl w:val="0"/>
+        </w:rPr>
+        <w:t xml:space="preserve"> </w:t>
       </w:r>
     </w:p>
     <w:p>

</xml_diff>